<commit_message>
Re-modelled cattleFiels as trailing shoe
</commit_message>
<xml_diff>
--- a/Lab-trails/2026-04-29-cattle-slurry-retrail/Acdification.docx
+++ b/Lab-trails/2026-04-29-cattle-slurry-retrail/Acdification.docx
@@ -6,21 +6,8 @@
       <w:pPr>
         <w:pStyle w:val="Heading2"/>
       </w:pPr>
-      <w:proofErr w:type="spellStart"/>
       <w:r>
-        <w:t>Slurry</w:t>
-      </w:r>
-      <w:proofErr w:type="spellEnd"/>
-      <w:r>
-        <w:t xml:space="preserve"> </w:t>
-      </w:r>
-      <w:proofErr w:type="spellStart"/>
-      <w:r>
-        <w:t>acidification</w:t>
-      </w:r>
-      <w:proofErr w:type="spellEnd"/>
-      <w:r>
-        <w:t>:</w:t>
+        <w:t>Slurry acidification:</w:t>
       </w:r>
     </w:p>
     <w:p>
@@ -1316,7 +1303,6 @@
       <w:pPr>
         <w:rPr>
           <w:rFonts w:eastAsiaTheme="minorEastAsia"/>
-          <w:iCs/>
         </w:rPr>
       </w:pPr>
       <w:r>
@@ -1337,6 +1323,79 @@
           <m:t>μL</m:t>
         </m:r>
       </m:oMath>
+    </w:p>
+    <w:p>
+      <w:pPr>
+        <w:rPr>
+          <w:rFonts w:eastAsiaTheme="minorEastAsia"/>
+        </w:rPr>
+      </w:pPr>
+    </w:p>
+    <w:p>
+      <w:pPr>
+        <w:rPr>
+          <w:rFonts w:eastAsiaTheme="minorEastAsia"/>
+          <w:b/>
+          <w:bCs/>
+        </w:rPr>
+      </w:pPr>
+      <w:r>
+        <w:rPr>
+          <w:rFonts w:eastAsiaTheme="minorEastAsia"/>
+          <w:b/>
+          <w:bCs/>
+        </w:rPr>
+        <w:t>AA:</w:t>
+      </w:r>
+    </w:p>
+    <w:p>
+      <w:pPr>
+        <w:rPr>
+          <w:rFonts w:eastAsiaTheme="minorEastAsia"/>
+          <w:iCs/>
+        </w:rPr>
+      </w:pPr>
+      <w:r>
+        <w:rPr>
+          <w:rFonts w:eastAsiaTheme="minorEastAsia"/>
+        </w:rPr>
+        <w:t xml:space="preserve">Added in 100 </w:t>
+      </w:r>
+      <m:oMath>
+        <m:r>
+          <m:rPr>
+            <m:sty m:val="p"/>
+          </m:rPr>
+          <w:rPr>
+            <w:rFonts w:ascii="Cambria Math" w:eastAsiaTheme="minorEastAsia" w:hAnsi="Cambria Math"/>
+          </w:rPr>
+          <m:t>μL</m:t>
+        </m:r>
+      </m:oMath>
+      <w:r>
+        <w:rPr>
+          <w:rFonts w:eastAsiaTheme="minorEastAsia"/>
+          <w:iCs/>
+        </w:rPr>
+        <w:t xml:space="preserve"> until reaching same pH</w:t>
+      </w:r>
+    </w:p>
+    <w:p>
+      <w:pPr>
+        <w:rPr>
+          <w:rFonts w:eastAsiaTheme="minorEastAsia"/>
+          <w:iCs/>
+          <w:u w:val="double"/>
+        </w:rPr>
+      </w:pPr>
+      <w:r>
+        <w:rPr>
+          <w:rFonts w:eastAsiaTheme="minorEastAsia"/>
+          <w:iCs/>
+          <w:u w:val="double"/>
+        </w:rPr>
+        <w:t xml:space="preserve">1 mL applied </w:t>
+      </w:r>
     </w:p>
     <w:p/>
     <w:sectPr>

</xml_diff>